<commit_message>
Quito el apartado de presupuestos y actualizo el documento del curso
</commit_message>
<xml_diff>
--- a/CURSO_COMPLETO_SISTEMA_DE_GASTOS.docx
+++ b/CURSO_COMPLETO_SISTEMA_DE_GASTOS.docx
@@ -328,47 +328,6 @@
       </w:r>
       <w:r>
         <w:t xml:space="preserve">registros.</w:t>
-      </w:r>
-    </w:p>
-    <w:p>
-      <w:pPr>
-        <w:pStyle w:val="Compact"/>
-        <w:numPr>
-          <w:ilvl w:val="0"/>
-          <w:numId w:val="1001"/>
-        </w:numPr>
-      </w:pPr>
-      <w:r>
-        <w:t xml:space="preserve">Tiene</w:t>
-      </w:r>
-      <w:r>
-        <w:t xml:space="preserve"> </w:t>
-      </w:r>
-      <w:r>
-        <w:rPr>
-          <w:b/>
-          <w:bCs/>
-        </w:rPr>
-        <w:t xml:space="preserve">presupuestos</w:t>
-      </w:r>
-      <w:r>
-        <w:t xml:space="preserve">: puedes poner un</w:t>
-      </w:r>
-      <w:r>
-        <w:t xml:space="preserve"> </w:t>
-      </w:r>
-      <w:r>
-        <w:rPr>
-          <w:b/>
-          <w:bCs/>
-        </w:rPr>
-        <w:t xml:space="preserve">límite de gasto mensual</w:t>
-      </w:r>
-      <w:r>
-        <w:t xml:space="preserve"> </w:t>
-      </w:r>
-      <w:r>
-        <w:t xml:space="preserve">(total y por categoría) y la página te avisa cuando lo superas.</w:t>
       </w:r>
     </w:p>
     <w:p>
@@ -1012,7 +971,7 @@
         <w:pStyle w:val="FirstParagraph"/>
       </w:pPr>
       <w:r>
-        <w:t xml:space="preserve">Nuestra página guarda sus datos (gastos, ingresos, presupuestos) dentro del</w:t>
+        <w:t xml:space="preserve">Nuestra página guarda sus datos (gastos, ingresos) dentro del</w:t>
       </w:r>
       <w:r>
         <w:t xml:space="preserve"> </w:t>
@@ -1877,13 +1836,13 @@
           <w:b/>
           <w:bCs/>
         </w:rPr>
-        <w:t xml:space="preserve">Presupuestos:</w:t>
-      </w:r>
-      <w:r>
-        <w:t xml:space="preserve"> </w:t>
-      </w:r>
-      <w:r>
-        <w:t xml:space="preserve">límite mensual total y por categoría, con barras de progreso y avisos.</w:t>
+        <w:t xml:space="preserve">Visualizaciones:</w:t>
+      </w:r>
+      <w:r>
+        <w:t xml:space="preserve"> </w:t>
+      </w:r>
+      <w:r>
+        <w:t xml:space="preserve">gráfico de barras, gráfico de evolución de 12 meses y balance anual.</w:t>
       </w:r>
     </w:p>
     <w:p>
@@ -1899,28 +1858,6 @@
           <w:b/>
           <w:bCs/>
         </w:rPr>
-        <w:t xml:space="preserve">Visualizaciones:</w:t>
-      </w:r>
-      <w:r>
-        <w:t xml:space="preserve"> </w:t>
-      </w:r>
-      <w:r>
-        <w:t xml:space="preserve">gráfico de barras, gráfico de evolución de 12 meses y balance anual.</w:t>
-      </w:r>
-    </w:p>
-    <w:p>
-      <w:pPr>
-        <w:pStyle w:val="Compact"/>
-        <w:numPr>
-          <w:ilvl w:val="1"/>
-          <w:numId w:val="1007"/>
-        </w:numPr>
-      </w:pPr>
-      <w:r>
-        <w:rPr>
-          <w:b/>
-          <w:bCs/>
-        </w:rPr>
         <w:t xml:space="preserve">Seguridad/solidez:</w:t>
       </w:r>
       <w:r>
@@ -1960,7 +1897,7 @@
         <w:t xml:space="preserve"> </w:t>
       </w:r>
       <w:r>
-        <w:t xml:space="preserve">con doble clic en tu navegador y recorre cada sección: Registrar, Historial, Presupuestos, los dos gráficos, Balance y los botones de abajo.</w:t>
+        <w:t xml:space="preserve">con doble clic en tu navegador y recorre cada sección: Registrar, Historial, los dos gráficos, Balance y los botones de abajo.</w:t>
       </w:r>
     </w:p>
     <w:p>
@@ -3900,34 +3837,6 @@
                 <w:b/>
                 <w:bCs/>
               </w:rPr>
-              <w:t xml:space="preserve">🎯 Presupuestos</w:t>
-            </w:r>
-          </w:p>
-        </w:tc>
-        <w:tc>
-          <w:tcPr/>
-          <w:p>
-            <w:pPr>
-              <w:pStyle w:val="Compact"/>
-            </w:pPr>
-            <w:r>
-              <w:t xml:space="preserve">Pon un límite total del mes y límites por categoría. Aparecen barras de progreso y avisos cuando te pasas.</w:t>
-            </w:r>
-          </w:p>
-        </w:tc>
-      </w:tr>
-      <w:tr>
-        <w:tc>
-          <w:tcPr/>
-          <w:p>
-            <w:pPr>
-              <w:pStyle w:val="Compact"/>
-            </w:pPr>
-            <w:r>
-              <w:rPr>
-                <w:b/>
-                <w:bCs/>
-              </w:rPr>
               <w:t xml:space="preserve">📊 Gastos por categoría</w:t>
             </w:r>
           </w:p>
@@ -5345,7 +5254,7 @@
         <w:t xml:space="preserve"> </w:t>
       </w:r>
       <w:r>
-        <w:t xml:space="preserve">útiles: presupuestos, gráficos, respaldos, historial, búsqueda, edición.</w:t>
+        <w:t xml:space="preserve">útiles: gráficos, respaldos, historial, búsqueda, edición.</w:t>
       </w:r>
     </w:p>
     <w:p>

</xml_diff>